<commit_message>
Update system_analysis docs: requirements specification and user stories
</commit_message>
<xml_diff>
--- a/docs/system_analysis/MSE800_User_Stories.docx
+++ b/docs/system_analysis/MSE800_User_Stories.docx
@@ -10,8 +10,6 @@
           <w:rFonts w:asciiTheme="majorHAnsi" w:hAnsiTheme="majorHAnsi"/>
         </w:rPr>
       </w:pPr>
-      <w:bookmarkStart w:id="0" w:name="_GoBack"/>
-      <w:bookmarkEnd w:id="0"/>
       <w:r>
         <w:rPr>
           <w:rFonts w:eastAsia="Cambria" w:cs="Cambria" w:asciiTheme="majorHAnsi" w:hAnsiTheme="majorHAnsi"/>
@@ -3315,25 +3313,6 @@
           <w:rFonts w:asciiTheme="majorHAnsi" w:hAnsiTheme="majorHAnsi"/>
         </w:rPr>
         <w:t>A teacher edits only their own lessons. A coordinator can edit any lesson.</w:t>
-      </w:r>
-    </w:p>
-    <w:p>
-      <w:pPr>
-        <w:pStyle w:val="21"/>
-        <w:numPr>
-          <w:ilvl w:val="0"/>
-          <w:numId w:val="1"/>
-        </w:numPr>
-        <w:spacing w:after="100" w:line="276" w:lineRule="auto"/>
-        <w:rPr>
-          <w:rFonts w:asciiTheme="majorHAnsi" w:hAnsiTheme="majorHAnsi"/>
-        </w:rPr>
-      </w:pPr>
-      <w:r>
-        <w:rPr>
-          <w:rFonts w:asciiTheme="majorHAnsi" w:hAnsiTheme="majorHAnsi"/>
-        </w:rPr>
-        <w:t>* The story does not say this. The team to confirm that coordinators can also do it.</w:t>
       </w:r>
     </w:p>
     <w:p>
@@ -15741,25 +15720,44 @@
             </w:pPr>
             <w:r>
               <w:rPr>
-                <w:rFonts w:asciiTheme="majorHAnsi" w:hAnsiTheme="majorHAnsi"/>
+                <w:rFonts w:hint="eastAsia" w:asciiTheme="majorHAnsi" w:hAnsiTheme="majorHAnsi"/>
                 <w:sz w:val="18"/>
                 <w:szCs w:val="18"/>
               </w:rPr>
-              <w:t xml:space="preserve">The club covers many parts of life in New Zealand, so tags are topics such as transport, health, shopping. </w:t>
-            </w:r>
-            <w:r>
-              <w:rPr>
-                <w:rFonts w:asciiTheme="majorHAnsi" w:hAnsiTheme="majorHAnsi"/>
-                <w:sz w:val="16"/>
-                <w:szCs w:val="16"/>
-              </w:rPr>
-              <w:t>Lessons are shared between teachers so they can be reused, but only the author or a coordinator can edit or delete a lesson. A lesson is teaching content and is not tied to one class.</w:t>
-            </w:r>
+              <w:t>Coordinators can edit any lesson</w:t>
+            </w:r>
+            <w:bookmarkStart w:id="0" w:name="_GoBack"/>
+            <w:bookmarkEnd w:id="0"/>
             <w:r>
               <w:rPr>
                 <w:rFonts w:hint="eastAsia" w:asciiTheme="majorHAnsi" w:hAnsiTheme="majorHAnsi"/>
-                <w:sz w:val="16"/>
-                <w:szCs w:val="16"/>
+                <w:sz w:val="18"/>
+                <w:szCs w:val="18"/>
+              </w:rPr>
+              <w:t>.</w:t>
+            </w:r>
+            <w:r>
+              <w:rPr>
+                <w:rFonts w:hint="eastAsia" w:asciiTheme="majorHAnsi" w:hAnsiTheme="majorHAnsi"/>
+                <w:sz w:val="18"/>
+                <w:szCs w:val="18"/>
+                <w:lang w:val="en-US" w:eastAsia="zh-CN"/>
+              </w:rPr>
+              <w:t xml:space="preserve"> </w:t>
+            </w:r>
+            <w:r>
+              <w:rPr>
+                <w:rFonts w:asciiTheme="majorHAnsi" w:hAnsiTheme="majorHAnsi"/>
+                <w:sz w:val="18"/>
+                <w:szCs w:val="18"/>
+              </w:rPr>
+              <w:t>The club covers many parts of life in New Zealand, so tags are topics such as transport, health, shopping. Lessons are shared between teachers so they can be reused, but only the author or a coordinator can edit or delete a lesson. A lesson is teaching content and is not tied to one class.</w:t>
+            </w:r>
+            <w:r>
+              <w:rPr>
+                <w:rFonts w:hint="eastAsia" w:asciiTheme="majorHAnsi" w:hAnsiTheme="majorHAnsi"/>
+                <w:sz w:val="18"/>
+                <w:szCs w:val="18"/>
               </w:rPr>
               <w:t xml:space="preserve"> </w:t>
             </w:r>

</xml_diff>

<commit_message>
docs: record development decisions in the US-008, US-012 and US-015 notes
The story texts had not changed since 21 October, but three decisions
made during development refine them. Each "Notes and assumptions" now
ends with a dated "Decided" sentence; the original text is kept.

- US-008 (23 Oct): unreviewed Māori content is hidden from learners
  only; staff still see, edit and link it; wording and rule still need
  the Kaiārahi's agreement
- US-012 (25 Oct): same-name learners are never guessed; wrong names
  counted per phone (10) with a per-address limit (50); sign-ins are
  recorded as made by the teacher who opened check-in
- US-015 (25 Oct): unticking sets absent instead of deleting; the
  change log cannot be edited or deleted; history is coordinator-only;
  a reason can be stored but has no box yet

Refs: US-008, US-012, US-015
</commit_message>
<xml_diff>
--- a/docs/system_analysis/MSE800_User_Stories.docx
+++ b/docs/system_analysis/MSE800_User_Stories.docx
@@ -20473,7 +20473,7 @@
                 <w:sz w:val="18"/>
                 <w:szCs w:val="18"/>
               </w:rPr>
-              <w:t>Supports the Protection principle of Te Tiriti o Waitangi. The review step and its wording are agreed with a Kaiārahi, and that consultation is recorded for the report. The coordinator records the review after the Kaiārahi confirms outside the system. Open question: block or only label unreviewed lessons? Start with a label and change it after consultation.</w:t>
+              <w:t>Supports the Protection principle of Te Tiriti o Waitangi. The review step and its wording are agreed with a Kaiārahi, and that consultation is recorded for the report. The coordinator records the review after the Kaiārahi confirms outside the system. Open question: block or only label unreviewed lessons? Start with a label and change it after consultation. Decided 23 October 2026: unreviewed lessons with Māori content are hidden from learners only. Teachers and coordinators still see and edit them, and they can still be linked to classes. The label wording and this rule still need the Kaiārahi's agreement.</w:t>
             </w:r>
           </w:p>
         </w:tc>
@@ -29751,7 +29751,7 @@
                 <w:sz w:val="18"/>
                 <w:szCs w:val="18"/>
               </w:rPr>
-              <w:t>No app or account. Names are typed and matched, so the class list is never shown. Only name and time are stored. Open question: is the 4-hour limit enough if the code photo is shared? No phone: the teacher ticks (US-004). Planned for later.</w:t>
+              <w:t>No app or account. Names are typed and matched, so the class list is never shown. Only name and time are stored. Open question: is the 4-hour limit enough if the code photo is shared? No phone: the teacher ticks (US-004). Planned for later. Decided 25 October 2026: a name shared by two learners is never guessed; the learner is asked to see the teacher, who ticks the right person. Wrong names are counted per phone (10 in 10 minutes), with a higher limit of 50 per network address, so one class on one Wi-Fi is not blocked together. A sign-in is recorded as made by the teacher who opened check-in.</w:t>
             </w:r>
           </w:p>
         </w:tc>
@@ -37005,7 +37005,7 @@
                 <w:sz w:val="18"/>
                 <w:szCs w:val="18"/>
               </w:rPr>
-              <w:t>Only coordinators correct past sessions. Teachers can still tick and untick during the class itself (US-004). Each change keeps who made it and when.</w:t>
+              <w:t>Only coordinators correct past sessions. Teachers can still tick and untick during the class itself (US-004). Each change keeps who made it and when. Decided 25 October 2026: unticking a learner here sets the record to absent instead of deleting it, so each change-log entry keeps its record and the present count still falls by 1. The change log cannot be edited or deleted. The change history is shown to coordinators only. A reason can be stored, but the page has no reason box yet.</w:t>
             </w:r>
           </w:p>
         </w:tc>

</xml_diff>

<commit_message>
docs: correct Sprint 3 to 24–28 October
The team confirmed Sprint 3 as 24–28 October at the meeting of
20 October (minutes 6), but three documents still said 24–27 October.

- User stories: US-002, US-005 and US-015
- Requirements Specification: the sprint dates under the story list
- Test Plan: section 7.1 note and the Sprint 3 row of the schedule
</commit_message>
<xml_diff>
--- a/docs/system_analysis/MSE800_User_Stories.docx
+++ b/docs/system_analysis/MSE800_User_Stories.docx
@@ -6207,7 +6207,7 @@
                 <w:sz w:val="21"/>
                 <w:szCs w:val="21"/>
               </w:rPr>
-              <w:t>Sprint 3 (24–27 Oct)</w:t>
+              <w:t>Sprint 3 (24–28 Oct)</w:t>
             </w:r>
           </w:p>
         </w:tc>
@@ -13199,7 +13199,7 @@
                 <w:sz w:val="21"/>
                 <w:szCs w:val="21"/>
               </w:rPr>
-              <w:t>Sprint 3 (24–27 Oct)</w:t>
+              <w:t>Sprint 3 (24–28 Oct)</w:t>
             </w:r>
           </w:p>
         </w:tc>
@@ -36777,7 +36777,7 @@
                 <w:sz w:val="21"/>
                 <w:szCs w:val="21"/>
               </w:rPr>
-              <w:t>Sprint 3 (24–27 Oct)</w:t>
+              <w:t>Sprint 3 (24–28 Oct)</w:t>
             </w:r>
           </w:p>
         </w:tc>

</xml_diff>